<commit_message>
fix: generate Word-compatible manual fields
</commit_message>
<xml_diff>
--- a/docs/NexoraAI-Administrator-Manual.docx
+++ b/docs/NexoraAI-Administrator-Manual.docx
@@ -148,10 +148,18 @@
       </w:r>
     </w:p>
     <w:p>
-      <w:fldChar w:fldCharType="begin"/>
-      <w:instrText xml:space="preserve"> TOC \o "1-3" \h \z \u </w:instrText>
-      <w:fldChar w:fldCharType="separate"/>
-      <w:fldChar w:fldCharType="end"/>
+      <w:r>
+        <w:fldChar w:fldCharType="begin"/>
+      </w:r>
+      <w:r>
+        <w:instrText xml:space="preserve"> TOC \o "1-3" \h \z \u </w:instrText>
+      </w:r>
+      <w:r>
+        <w:fldChar w:fldCharType="separate"/>
+      </w:r>
+      <w:r>
+        <w:fldChar w:fldCharType="end"/>
+      </w:r>
     </w:p>
     <w:p>
       <w:r>
@@ -11475,21 +11483,69 @@
       </w:rPr>
       <w:t xml:space="preserve">NexoraAI  •  Internal Product Documentation  •  Page </w:t>
     </w:r>
-    <w:fldChar w:fldCharType="begin"/>
-    <w:instrText xml:space="preserve"> PAGE </w:instrText>
-    <w:fldChar w:fldCharType="separate"/>
-    <w:fldChar w:fldCharType="end"/>
     <w:r>
       <w:rPr>
         <w:color w:val="666666"/>
         <w:sz w:val="16"/>
       </w:rPr>
+      <w:fldChar w:fldCharType="begin"/>
+    </w:r>
+    <w:r>
+      <w:rPr>
+        <w:color w:val="666666"/>
+        <w:sz w:val="16"/>
+      </w:rPr>
+      <w:instrText xml:space="preserve"> PAGE </w:instrText>
+    </w:r>
+    <w:r>
+      <w:rPr>
+        <w:color w:val="666666"/>
+        <w:sz w:val="16"/>
+      </w:rPr>
+      <w:fldChar w:fldCharType="separate"/>
+    </w:r>
+    <w:r>
+      <w:rPr>
+        <w:color w:val="666666"/>
+        <w:sz w:val="16"/>
+      </w:rPr>
+      <w:fldChar w:fldCharType="end"/>
+    </w:r>
+    <w:r>
+      <w:rPr>
+        <w:color w:val="666666"/>
+        <w:sz w:val="16"/>
+      </w:rPr>
       <w:t xml:space="preserve"> of </w:t>
     </w:r>
-    <w:fldChar w:fldCharType="begin"/>
-    <w:instrText xml:space="preserve"> NUMPAGES </w:instrText>
-    <w:fldChar w:fldCharType="separate"/>
-    <w:fldChar w:fldCharType="end"/>
+    <w:r>
+      <w:rPr>
+        <w:color w:val="666666"/>
+        <w:sz w:val="16"/>
+      </w:rPr>
+      <w:fldChar w:fldCharType="begin"/>
+    </w:r>
+    <w:r>
+      <w:rPr>
+        <w:color w:val="666666"/>
+        <w:sz w:val="16"/>
+      </w:rPr>
+      <w:instrText xml:space="preserve"> NUMPAGES </w:instrText>
+    </w:r>
+    <w:r>
+      <w:rPr>
+        <w:color w:val="666666"/>
+        <w:sz w:val="16"/>
+      </w:rPr>
+      <w:fldChar w:fldCharType="separate"/>
+    </w:r>
+    <w:r>
+      <w:rPr>
+        <w:color w:val="666666"/>
+        <w:sz w:val="16"/>
+      </w:rPr>
+      <w:fldChar w:fldCharType="end"/>
+    </w:r>
   </w:p>
 </w:ftr>
 </file>

</xml_diff>

<commit_message>
feat: expand agent catalog and enterprise authentication
</commit_message>
<xml_diff>
--- a/docs/NexoraAI-Administrator-Manual.docx
+++ b/docs/NexoraAI-Administrator-Manual.docx
@@ -5487,6 +5487,87 @@
     <w:p>
       <w:r>
         <w:t>Assignments are grouped into REST APIs, Databases, Mail, Documents, Messaging, MCP, and Visualization. Only assign capabilities required by the Agent.</w:t>
+      </w:r>
+    </w:p>
+    <w:p>
+      <w:r>
+        <w:t xml:space="preserve">For a new Agent, enter </w:t>
+      </w:r>
+      <w:r>
+        <w:rPr>
+          <w:b/>
+        </w:rPr>
+        <w:t>Agent Name</w:t>
+      </w:r>
+      <w:r>
+        <w:t xml:space="preserve"> and select </w:t>
+      </w:r>
+      <w:r>
+        <w:rPr>
+          <w:b/>
+        </w:rPr>
+        <w:t>Integrations</w:t>
+      </w:r>
+      <w:r>
+        <w:t xml:space="preserve">. NexoraAI automatically creates a private draft so integration bindings have a stable Agent ID. The draft appears only in </w:t>
+      </w:r>
+      <w:r>
+        <w:rPr>
+          <w:b/>
+        </w:rPr>
+        <w:t>Agent Management</w:t>
+      </w:r>
+      <w:r>
+        <w:t xml:space="preserve"> with a </w:t>
+      </w:r>
+      <w:r>
+        <w:rPr>
+          <w:b/>
+        </w:rPr>
+        <w:t>Draft</w:t>
+      </w:r>
+      <w:r>
+        <w:t xml:space="preserve"> badge; it cannot be selected in Chat, delegated to, or published to Agent Catalog. Select </w:t>
+      </w:r>
+      <w:r>
+        <w:rPr>
+          <w:b/>
+        </w:rPr>
+        <w:t>Finish setup</w:t>
+      </w:r>
+      <w:r>
+        <w:t xml:space="preserve"> to save the latest Agent fields and activate it, or </w:t>
+      </w:r>
+      <w:r>
+        <w:rPr>
+          <w:b/>
+        </w:rPr>
+        <w:t>Cancel setup</w:t>
+      </w:r>
+      <w:r>
+        <w:t xml:space="preserve"> to immediately remove the draft and all of its bindings. Abandoned drafts expire after 24 hours by default and are removed by the background cleanup worker. Operators may set </w:t>
+      </w:r>
+      <w:r>
+        <w:rPr>
+          <w:rFonts w:ascii="Consolas" w:hAnsi="Consolas"/>
+          <w:color w:val="505050"/>
+          <w:sz w:val="18"/>
+        </w:rPr>
+        <w:t>AGENT_DRAFT_RETENTION_HOURS</w:t>
+      </w:r>
+      <w:r>
+        <w:t xml:space="preserve"> (1–168) and </w:t>
+      </w:r>
+      <w:r>
+        <w:rPr>
+          <w:rFonts w:ascii="Consolas" w:hAnsi="Consolas"/>
+          <w:color w:val="505050"/>
+          <w:sz w:val="18"/>
+        </w:rPr>
+        <w:t>AGENT_DRAFT_CLEANUP_INTERVAL_SECONDS</w:t>
+      </w:r>
+      <w:r>
+        <w:t xml:space="preserve"> (minimum 60).</w:t>
       </w:r>
     </w:p>
     <w:p>

</xml_diff>